<commit_message>
revert false Spider-Man resolution, fix date comparison bug
</commit_message>
<xml_diff>
--- a/reports/scorecards/AFG_Scorecard_2026-08-05.docx
+++ b/reports/scorecards/AFG_Scorecard_2026-08-05.docx
@@ -102,7 +102,7 @@
                 <w:color w:val="17365D"/>
                 <w:sz w:val="44"/>
               </w:rPr>
-              <w:t>4</w:t>
+              <w:t>3</w:t>
             </w:r>
           </w:p>
           <w:p>
@@ -147,7 +147,7 @@
                 <w:color w:val="1F6F3D"/>
                 <w:sz w:val="44"/>
               </w:rPr>
-              <w:t>3</w:t>
+              <w:t>2</w:t>
             </w:r>
           </w:p>
           <w:p>
@@ -237,7 +237,7 @@
                 <w:color w:val="17365D"/>
                 <w:sz w:val="44"/>
               </w:rPr>
-              <w:t>0.161</w:t>
+              <w:t>0.132</w:t>
             </w:r>
           </w:p>
           <w:p>
@@ -282,7 +282,7 @@
           <w:color w:val="17365D"/>
           <w:sz w:val="26"/>
         </w:rPr>
-        <w:t>75%</w:t>
+        <w:t>67%</w:t>
       </w:r>
       <w:r>
         <w:rPr>
@@ -312,7 +312,7 @@
           <w:color w:val="808080"/>
           <w:sz w:val="21"/>
         </w:rPr>
-        <w:t xml:space="preserve"> by 0.050 Brier points</w:t>
+        <w:t xml:space="preserve"> by 0.014 Brier points</w:t>
       </w:r>
       <w:r>
         <w:rPr>
@@ -322,7 +322,7 @@
           <w:color w:val="808080"/>
           <w:sz w:val="19"/>
         </w:rPr>
-        <w:t xml:space="preserve">  (Market Brier: 0.212)</w:t>
+        <w:t xml:space="preserve">  (Market Brier: 0.146)</w:t>
       </w:r>
     </w:p>
     <w:p>
@@ -1069,7 +1069,7 @@
                 <w:color w:val="808080"/>
                 <w:sz w:val="19"/>
               </w:rPr>
-              <w:t>1</w:t>
+              <w:t>—</w:t>
             </w:r>
           </w:p>
         </w:tc>
@@ -1093,10 +1093,10 @@
                 <w:rFonts w:ascii="Cambria" w:hAnsi="Cambria"/>
                 <w:b w:val="0"/>
                 <w:i w:val="0"/>
-                <w:color w:val="1F6F3D"/>
+                <w:color w:val="808080"/>
                 <w:sz w:val="19"/>
               </w:rPr>
-              <w:t>1</w:t>
+              <w:t>—</w:t>
             </w:r>
           </w:p>
         </w:tc>
@@ -1120,10 +1120,10 @@
                 <w:rFonts w:ascii="Cambria" w:hAnsi="Cambria"/>
                 <w:b w:val="0"/>
                 <w:i w:val="0"/>
-                <w:color w:val="A6231F"/>
+                <w:color w:val="808080"/>
                 <w:sz w:val="19"/>
               </w:rPr>
-              <w:t>0</w:t>
+              <w:t>—</w:t>
             </w:r>
           </w:p>
         </w:tc>
@@ -1147,10 +1147,10 @@
                 <w:rFonts w:ascii="Cambria" w:hAnsi="Cambria"/>
                 <w:b w:val="0"/>
                 <w:i w:val="0"/>
-                <w:color w:val="17365D"/>
+                <w:color w:val="808080"/>
                 <w:sz w:val="19"/>
               </w:rPr>
-              <w:t>100%</w:t>
+              <w:t>—</w:t>
             </w:r>
           </w:p>
         </w:tc>
@@ -1174,10 +1174,10 @@
                 <w:rFonts w:ascii="Cambria" w:hAnsi="Cambria"/>
                 <w:b w:val="0"/>
                 <w:i w:val="0"/>
-                <w:color w:val="17365D"/>
+                <w:color w:val="808080"/>
                 <w:sz w:val="19"/>
               </w:rPr>
-              <w:t>0.250</w:t>
+              <w:t>—</w:t>
             </w:r>
           </w:p>
         </w:tc>
@@ -1792,197 +1792,6 @@
                 <w:color w:val="17365D"/>
                 <w:sz w:val="18"/>
               </w:rPr>
-              <w:t>Spider-Man Brand New Day — RT score above 90</w:t>
-            </w:r>
-          </w:p>
-        </w:tc>
-        <w:tc>
-          <w:tcPr>
-            <w:tcBorders>
-              <w:top w:val="single" w:sz="2" w:color="B0B8C8"/>
-              <w:left w:val="single" w:sz="2" w:color="B0B8C8"/>
-              <w:bottom w:val="single" w:sz="2" w:color="B0B8C8"/>
-              <w:right w:val="single" w:sz="2" w:color="B0B8C8"/>
-            </w:tcBorders>
-            <w:tcW w:w="1300" w:type="dxa"/>
-          </w:tcPr>
-          <w:p>
-            <w:pPr>
-              <w:spacing w:before="60" w:after="60"/>
-            </w:pPr>
-            <w:r/>
-            <w:r>
-              <w:rPr>
-                <w:rFonts w:ascii="Cambria" w:hAnsi="Cambria"/>
-                <w:b w:val="0"/>
-                <w:i w:val="0"/>
-                <w:color w:val="808080"/>
-                <w:sz w:val="18"/>
-              </w:rPr>
-              <w:t>Culture</w:t>
-            </w:r>
-          </w:p>
-        </w:tc>
-        <w:tc>
-          <w:tcPr>
-            <w:tcBorders>
-              <w:top w:val="single" w:sz="2" w:color="B0B8C8"/>
-              <w:left w:val="single" w:sz="2" w:color="B0B8C8"/>
-              <w:bottom w:val="single" w:sz="2" w:color="B0B8C8"/>
-              <w:right w:val="single" w:sz="2" w:color="B0B8C8"/>
-            </w:tcBorders>
-            <w:tcW w:w="800" w:type="dxa"/>
-          </w:tcPr>
-          <w:p>
-            <w:pPr>
-              <w:spacing w:before="60" w:after="60"/>
-            </w:pPr>
-            <w:r/>
-            <w:r>
-              <w:rPr>
-                <w:rFonts w:ascii="Cambria" w:hAnsi="Cambria"/>
-                <w:b w:val="0"/>
-                <w:i w:val="0"/>
-                <w:color w:val="808080"/>
-                <w:sz w:val="18"/>
-              </w:rPr>
-              <w:t>64%</w:t>
-            </w:r>
-          </w:p>
-        </w:tc>
-        <w:tc>
-          <w:tcPr>
-            <w:tcBorders>
-              <w:top w:val="single" w:sz="2" w:color="B0B8C8"/>
-              <w:left w:val="single" w:sz="2" w:color="B0B8C8"/>
-              <w:bottom w:val="single" w:sz="2" w:color="B0B8C8"/>
-              <w:right w:val="single" w:sz="2" w:color="B0B8C8"/>
-            </w:tcBorders>
-            <w:tcW w:w="800" w:type="dxa"/>
-          </w:tcPr>
-          <w:p>
-            <w:pPr>
-              <w:spacing w:before="60" w:after="60"/>
-            </w:pPr>
-            <w:r/>
-            <w:r>
-              <w:rPr>
-                <w:rFonts w:ascii="Cambria" w:hAnsi="Cambria"/>
-                <w:b w:val="0"/>
-                <w:i w:val="0"/>
-                <w:color w:val="17365D"/>
-                <w:sz w:val="18"/>
-              </w:rPr>
-              <w:t>50%</w:t>
-            </w:r>
-          </w:p>
-        </w:tc>
-        <w:tc>
-          <w:tcPr>
-            <w:tcBorders>
-              <w:top w:val="single" w:sz="2" w:color="B0B8C8"/>
-              <w:left w:val="single" w:sz="2" w:color="B0B8C8"/>
-              <w:bottom w:val="single" w:sz="2" w:color="B0B8C8"/>
-              <w:right w:val="single" w:sz="2" w:color="B0B8C8"/>
-            </w:tcBorders>
-            <w:tcW w:w="1300" w:type="dxa"/>
-          </w:tcPr>
-          <w:p>
-            <w:pPr>
-              <w:spacing w:before="60" w:after="60"/>
-            </w:pPr>
-            <w:r/>
-            <w:r>
-              <w:rPr>
-                <w:rFonts w:ascii="Cambria" w:hAnsi="Cambria"/>
-                <w:b/>
-                <w:i w:val="0"/>
-                <w:color w:val="A6231F"/>
-                <w:sz w:val="18"/>
-              </w:rPr>
-              <w:t>BUY NO</w:t>
-            </w:r>
-          </w:p>
-        </w:tc>
-        <w:tc>
-          <w:tcPr>
-            <w:tcBorders>
-              <w:top w:val="single" w:sz="2" w:color="B0B8C8"/>
-              <w:left w:val="single" w:sz="2" w:color="B0B8C8"/>
-              <w:bottom w:val="single" w:sz="2" w:color="B0B8C8"/>
-              <w:right w:val="single" w:sz="2" w:color="B0B8C8"/>
-            </w:tcBorders>
-            <w:tcW w:w="1000" w:type="dxa"/>
-          </w:tcPr>
-          <w:p>
-            <w:pPr>
-              <w:spacing w:before="60" w:after="60"/>
-            </w:pPr>
-            <w:r/>
-            <w:r>
-              <w:rPr>
-                <w:rFonts w:ascii="Cambria" w:hAnsi="Cambria"/>
-                <w:b w:val="0"/>
-                <w:i w:val="0"/>
-                <w:color w:val="808080"/>
-                <w:sz w:val="18"/>
-              </w:rPr>
-              <w:t>NO</w:t>
-            </w:r>
-          </w:p>
-        </w:tc>
-        <w:tc>
-          <w:tcPr>
-            <w:tcBorders>
-              <w:top w:val="single" w:sz="2" w:color="B0B8C8"/>
-              <w:left w:val="single" w:sz="2" w:color="B0B8C8"/>
-              <w:bottom w:val="single" w:sz="2" w:color="B0B8C8"/>
-              <w:right w:val="single" w:sz="2" w:color="B0B8C8"/>
-            </w:tcBorders>
-            <w:tcW w:w="2100" w:type="dxa"/>
-          </w:tcPr>
-          <w:p>
-            <w:pPr>
-              <w:spacing w:before="60" w:after="60"/>
-            </w:pPr>
-            <w:r/>
-            <w:r>
-              <w:rPr>
-                <w:rFonts w:ascii="Cambria" w:hAnsi="Cambria"/>
-                <w:b/>
-                <w:i w:val="0"/>
-                <w:color w:val="1F6F3D"/>
-                <w:sz w:val="18"/>
-              </w:rPr>
-              <w:t>✓ Correct</w:t>
-            </w:r>
-          </w:p>
-        </w:tc>
-      </w:tr>
-      <w:tr>
-        <w:tc>
-          <w:tcPr>
-            <w:tcBorders>
-              <w:top w:val="single" w:sz="2" w:color="B0B8C8"/>
-              <w:left w:val="single" w:sz="2" w:color="B0B8C8"/>
-              <w:bottom w:val="single" w:sz="2" w:color="B0B8C8"/>
-              <w:right w:val="single" w:sz="2" w:color="B0B8C8"/>
-            </w:tcBorders>
-            <w:tcW w:w="3500" w:type="dxa"/>
-          </w:tcPr>
-          <w:p>
-            <w:pPr>
-              <w:spacing w:before="60" w:after="60"/>
-            </w:pPr>
-            <w:r/>
-            <w:r>
-              <w:rPr>
-                <w:rFonts w:ascii="Cambria" w:hAnsi="Cambria"/>
-                <w:b w:val="0"/>
-                <w:i w:val="0"/>
-                <w:color w:val="17365D"/>
-                <w:sz w:val="18"/>
-              </w:rPr>
               <w:t>LeBron James Next Team — Cleveland Cavaliers</w:t>
             </w:r>
           </w:p>

</xml_diff>